<commit_message>
Remove internal docs and simplify public GitHub tree.
</commit_message>
<xml_diff>
--- a/docs/METRICS_DEFINITIONS.docx
+++ b/docs/METRICS_DEFINITIONS.docx
@@ -135,12 +135,52 @@
         <w:pStyle w:val="IntenseQuote"/>
       </w:pPr>
       <w:r>
+        <w:t>H = −Σ p_i log₂(p_i)</w:t>
+      </w:r>
+    </w:p>
+    <w:p>
+      <w:pPr>
+        <w:pStyle w:val="IntenseQuote"/>
+      </w:pPr>
+      <w:r>
         <w:t>H_rel = H / H_max = [−Σ p_i log₂(p_i)] / log₂(N_windows)</w:t>
       </w:r>
     </w:p>
     <w:p>
       <w:r>
-        <w:t>where p_i is the fraction of read starts in window i.</w:t>
+        <w:t>where:</w:t>
+      </w:r>
+    </w:p>
+    <w:p>
+      <w:pPr>
+        <w:pStyle w:val="ListBullet"/>
+      </w:pPr>
+      <w:r>
+        <w:t>H = raw Shannon entropy of the read-start distribution across windows. It measures how spread out mapped read start positions are along the genome: low H means reads cluster in a few windows (uneven coverage); high H means reads are distributed more evenly.</w:t>
+      </w:r>
+    </w:p>
+    <w:p>
+      <w:pPr>
+        <w:pStyle w:val="ListBullet"/>
+      </w:pPr>
+      <w:r>
+        <w:t>p_i = fraction of read starts in window i (reads in window i / total reads)</w:t>
+      </w:r>
+    </w:p>
+    <w:p>
+      <w:pPr>
+        <w:pStyle w:val="ListBullet"/>
+      </w:pPr>
+      <w:r>
+        <w:t>H_max = log₂(N_windows), the maximum entropy if all reads were perfectly evenly distributed across all windows</w:t>
+      </w:r>
+    </w:p>
+    <w:p>
+      <w:pPr>
+        <w:pStyle w:val="ListBullet"/>
+      </w:pPr>
+      <w:r>
+        <w:t>H_rel = relative entropy (0–1 scale), the value reported by PIGSTI</w:t>
       </w:r>
     </w:p>
     <w:p>

</xml_diff>